<commit_message>
Cash Counter Management Added
</commit_message>
<xml_diff>
--- a/Vps Information.docx
+++ b/Vps Information.docx
@@ -47,6 +47,36 @@
       </w:r>
       <w:proofErr w:type="spellEnd"/>
     </w:p>
+    <w:p/>
+    <w:p>
+      <w:r>
+        <w:t xml:space="preserve">When git pull error: </w:t>
+      </w:r>
+      <w:r>
+        <w:t>git pull origin master --no-rebase</w:t>
+      </w:r>
+    </w:p>
+    <w:p>
+      <w:r>
+        <w:t xml:space="preserve">To view latest commit ahead: </w:t>
+      </w:r>
+      <w:r>
+        <w:t xml:space="preserve">git </w:t>
+      </w:r>
+      <w:proofErr w:type="gramStart"/>
+      <w:r>
+        <w:t>log --</w:t>
+      </w:r>
+      <w:proofErr w:type="spellStart"/>
+      <w:r>
+        <w:t>oneline</w:t>
+      </w:r>
+      <w:proofErr w:type="spellEnd"/>
+      <w:proofErr w:type="gramEnd"/>
+      <w:r>
+        <w:t xml:space="preserve"> -5</w:t>
+      </w:r>
+    </w:p>
     <w:p>
       <w:r>
         <w:t xml:space="preserve">View Log: </w:t>
@@ -122,7 +152,15 @@
     </w:p>
     <w:p>
       <w:r>
-        <w:t>dotnet publish -c Release -o ./publish</w:t>
+        <w:t>dotnet publish -c Release -</w:t>
+      </w:r>
+      <w:proofErr w:type="gramStart"/>
+      <w:r>
+        <w:t>o .</w:t>
+      </w:r>
+      <w:proofErr w:type="gramEnd"/>
+      <w:r>
+        <w:t>/publish</w:t>
       </w:r>
     </w:p>
     <w:p/>
@@ -141,9 +179,14 @@
       </w:r>
       <w:proofErr w:type="spellStart"/>
       <w:r>
-        <w:t>skyforge-api:latest</w:t>
+        <w:t>skyforge-</w:t>
+      </w:r>
+      <w:proofErr w:type="gramStart"/>
+      <w:r>
+        <w:t>api:latest</w:t>
       </w:r>
       <w:proofErr w:type="spellEnd"/>
+      <w:proofErr w:type="gramEnd"/>
       <w:r>
         <w:t xml:space="preserve"> .</w:t>
       </w:r>
@@ -192,13 +235,20 @@
           <w:i/>
           <w:iCs/>
         </w:rPr>
-        <w:lastRenderedPageBreak/>
         <w:t># Run new container</w:t>
       </w:r>
     </w:p>
     <w:p>
       <w:r>
-        <w:t>docker run -d \</w:t>
+        <w:t xml:space="preserve">docker </w:t>
+      </w:r>
+      <w:proofErr w:type="gramStart"/>
+      <w:r>
+        <w:t>run -d</w:t>
+      </w:r>
+      <w:proofErr w:type="gramEnd"/>
+      <w:r>
+        <w:t xml:space="preserve"> \</w:t>
       </w:r>
     </w:p>
     <w:p>
@@ -239,12 +289,49 @@
     </w:p>
     <w:p>
       <w:r>
-        <w:t xml:space="preserve">  -e ASPNETCORE_URLS=http://+:8080 \</w:t>
-      </w:r>
-    </w:p>
-    <w:p>
-      <w:r>
-        <w:t xml:space="preserve">  -e ConnectionStrings__DefaultConnection="Host=postgres;Port=5432;Database=ams_db;Username=ams_user;Password=Admin123456" \</w:t>
+        <w:t xml:space="preserve">  -e ASPNETCORE_URLS=</w:t>
+      </w:r>
+      <w:proofErr w:type="gramStart"/>
+      <w:r>
+        <w:t>http://+:8080 \</w:t>
+      </w:r>
+      <w:proofErr w:type="gramEnd"/>
+    </w:p>
+    <w:p>
+      <w:r>
+        <w:t xml:space="preserve">  -e ConnectionStrings__DefaultConnection="Host=</w:t>
+      </w:r>
+      <w:proofErr w:type="gramStart"/>
+      <w:r>
+        <w:t>postgres;Port</w:t>
+      </w:r>
+      <w:proofErr w:type="gramEnd"/>
+      <w:r>
+        <w:t>=</w:t>
+      </w:r>
+      <w:proofErr w:type="gramStart"/>
+      <w:r>
+        <w:t>5432;Database</w:t>
+      </w:r>
+      <w:proofErr w:type="gramEnd"/>
+      <w:r>
+        <w:t>=ams_</w:t>
+      </w:r>
+      <w:proofErr w:type="gramStart"/>
+      <w:r>
+        <w:t>db;Username</w:t>
+      </w:r>
+      <w:proofErr w:type="gramEnd"/>
+      <w:r>
+        <w:t>=ams_</w:t>
+      </w:r>
+      <w:proofErr w:type="gramStart"/>
+      <w:r>
+        <w:t>user;Password</w:t>
+      </w:r>
+      <w:proofErr w:type="gramEnd"/>
+      <w:r>
+        <w:t>=Admin123456" \</w:t>
       </w:r>
     </w:p>
     <w:p>
@@ -268,9 +355,14 @@
       </w:r>
       <w:proofErr w:type="spellStart"/>
       <w:r>
-        <w:t>skyforge-api:latest</w:t>
+        <w:t>skyforge-</w:t>
+      </w:r>
+      <w:proofErr w:type="gramStart"/>
+      <w:r>
+        <w:t>api:latest</w:t>
       </w:r>
       <w:proofErr w:type="spellEnd"/>
+      <w:proofErr w:type="gramEnd"/>
     </w:p>
     <w:p/>
     <w:p/>
@@ -290,7 +382,11 @@
         <w:br/>
       </w:r>
       <w:r>
-        <w:t>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</w:t>
+        <w:t>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</w:t>
+      </w:r>
+      <w:r>
+        <w:lastRenderedPageBreak/>
+        <w:t>GdkQVNRLWVZeEZnXCIsXCJleHBpcnlcIjpcIjIwMjYtMDYtMTlUMDk6NDE6NDcuNzA5ODkzNiswNTo0NVwiLFwiZXhwaXJlc19pblwiOjM1OTl9In0</w:t>
       </w:r>
     </w:p>
     <w:p/>
@@ -982,7 +1078,6 @@
   <w:style w:type="character" w:default="1" w:styleId="DefaultParagraphFont">
     <w:name w:val="Default Paragraph Font"/>
     <w:uiPriority w:val="1"/>
-    <w:semiHidden/>
     <w:unhideWhenUsed/>
   </w:style>
   <w:style w:type="table" w:default="1" w:styleId="TableNormal">

</xml_diff>

<commit_message>
Update Sequiences to UniqueNumber Generations
</commit_message>
<xml_diff>
--- a/Vps Information.docx
+++ b/Vps Information.docx
@@ -387,6 +387,95 @@
       <w:r>
         <w:lastRenderedPageBreak/>
         <w:t>GdkQVNRLWVZeEZnXCIsXCJleHBpcnlcIjpcIjIwMjYtMDYtMTlUMDk6NDE6NDcuNzA5ODkzNiswNTo0NVwiLFwiZXhwaXJlc19pblwiOjM1OTl9In0</w:t>
+      </w:r>
+    </w:p>
+    <w:p/>
+    <w:p/>
+    <w:p>
+      <w:r>
+        <w:t>#migrations of database</w:t>
+      </w:r>
+    </w:p>
+    <w:p>
+      <w:r>
+        <w:t xml:space="preserve">1.for </w:t>
+      </w:r>
+      <w:proofErr w:type="gramStart"/>
+      <w:r>
+        <w:t>create</w:t>
+      </w:r>
+      <w:proofErr w:type="gramEnd"/>
+      <w:r>
+        <w:t xml:space="preserve"> migrations</w:t>
+      </w:r>
+    </w:p>
+    <w:p>
+      <w:r>
+        <w:t xml:space="preserve">dotnet </w:t>
+      </w:r>
+      <w:proofErr w:type="spellStart"/>
+      <w:r>
+        <w:t>ef</w:t>
+      </w:r>
+      <w:proofErr w:type="spellEnd"/>
+      <w:r>
+        <w:t xml:space="preserve"> migrations add </w:t>
+      </w:r>
+      <w:proofErr w:type="spellStart"/>
+      <w:r>
+        <w:t>AddAuditLogsTable</w:t>
+      </w:r>
+      <w:proofErr w:type="spellEnd"/>
+    </w:p>
+    <w:p/>
+    <w:p>
+      <w:r>
+        <w:t>2.for update</w:t>
+      </w:r>
+    </w:p>
+    <w:p>
+      <w:r>
+        <w:t xml:space="preserve">dotnet </w:t>
+      </w:r>
+      <w:proofErr w:type="spellStart"/>
+      <w:r>
+        <w:t>ef</w:t>
+      </w:r>
+      <w:proofErr w:type="spellEnd"/>
+      <w:r>
+        <w:t xml:space="preserve"> database update --connection "Host=172.20.0.</w:t>
+      </w:r>
+      <w:proofErr w:type="gramStart"/>
+      <w:r>
+        <w:t>2;Port</w:t>
+      </w:r>
+      <w:proofErr w:type="gramEnd"/>
+      <w:r>
+        <w:t>=</w:t>
+      </w:r>
+      <w:proofErr w:type="gramStart"/>
+      <w:r>
+        <w:t>5432;Database</w:t>
+      </w:r>
+      <w:proofErr w:type="gramEnd"/>
+      <w:r>
+        <w:t>=ams_</w:t>
+      </w:r>
+      <w:proofErr w:type="gramStart"/>
+      <w:r>
+        <w:t>db;Username</w:t>
+      </w:r>
+      <w:proofErr w:type="gramEnd"/>
+      <w:r>
+        <w:t>=ams_</w:t>
+      </w:r>
+      <w:proofErr w:type="gramStart"/>
+      <w:r>
+        <w:t>user;Password</w:t>
+      </w:r>
+      <w:proofErr w:type="gramEnd"/>
+      <w:r>
+        <w:t>=Admin123456"</w:t>
       </w:r>
     </w:p>
     <w:p/>

</xml_diff>

<commit_message>
ItemImportProblem Try to Solved
</commit_message>
<xml_diff>
--- a/Vps Information.docx
+++ b/Vps Information.docx
@@ -1,6 +1,6 @@
 
 <file path=word/document.xml><?xml version="1.0" encoding="utf-8"?>
-<w:document xmlns:wpc="http://schemas.microsoft.com/office/word/2010/wordprocessingCanvas" xmlns:cx="http://schemas.microsoft.com/office/drawing/2014/chartex" xmlns:cx1="http://schemas.microsoft.com/office/drawing/2015/9/8/chartex" xmlns:cx2="http://schemas.microsoft.com/office/drawing/2015/10/21/chartex" xmlns:cx3="http://schemas.microsoft.com/office/drawing/2016/5/9/chartex" xmlns:cx4="http://schemas.microsoft.com/office/drawing/2016/5/10/chartex" xmlns:cx5="http://schemas.microsoft.com/office/drawing/2016/5/11/chartex" xmlns:cx6="http://schemas.microsoft.com/office/drawing/2016/5/12/chartex" xmlns:cx7="http://schemas.microsoft.com/office/drawing/2016/5/13/chartex" xmlns:cx8="http://schemas.microsoft.com/office/drawing/2016/5/14/chartex" xmlns:mc="http://schemas.openxmlformats.org/markup-compatibility/2006" xmlns:aink="http://schemas.microsoft.com/office/drawing/2016/ink" xmlns:am3d="http://schemas.microsoft.com/office/drawing/2017/model3d" xmlns:o="urn:schemas-microsoft-com:office:office" xmlns:oel="http://schemas.microsoft.com/office/2019/extlst" xmlns:r="http://schemas.openxmlformats.org/officeDocument/2006/relationships" xmlns:m="http://schemas.openxmlformats.org/officeDocument/2006/math" xmlns:v="urn:schemas-microsoft-com:vml" xmlns:wp14="http://schemas.microsoft.com/office/word/2010/wordprocessingDrawing" xmlns:wp="http://schemas.openxmlformats.org/drawingml/2006/wordprocessingDrawing" xmlns:w10="urn:schemas-microsoft-com:office:word" xmlns:w="http://schemas.openxmlformats.org/wordprocessingml/2006/main" xmlns:w14="http://schemas.microsoft.com/office/word/2010/wordml" xmlns:w15="http://schemas.microsoft.com/office/word/2012/wordml" xmlns:w16cex="http://schemas.microsoft.com/office/word/2018/wordml/cex" xmlns:w16cid="http://schemas.microsoft.com/office/word/2016/wordml/cid" xmlns:w16="http://schemas.microsoft.com/office/word/2018/wordml" xmlns:w16du="http://schemas.microsoft.com/office/word/2023/wordml/word16du" xmlns:w16sdtdh="http://schemas.microsoft.com/office/word/2020/wordml/sdtdatahash" xmlns:w16sdtfl="http://schemas.microsoft.com/office/word/2024/wordml/sdtformatlock" xmlns:w16se="http://schemas.microsoft.com/office/word/2015/wordml/symex" xmlns:wpg="http://schemas.microsoft.com/office/word/2010/wordprocessingGroup" xmlns:wpi="http://schemas.microsoft.com/office/word/2010/wordprocessingInk" xmlns:wne="http://schemas.microsoft.com/office/word/2006/wordml" xmlns:wps="http://schemas.microsoft.com/office/word/2010/wordprocessingShape" mc:Ignorable="w14 w15 w16se w16cid w16 w16cex w16sdtdh w16sdtfl w16du wp14">
+<w:document xmlns:wpc="http://schemas.microsoft.com/office/word/2010/wordprocessingCanvas" xmlns:cx="http://schemas.microsoft.com/office/drawing/2014/chartex" xmlns:cx1="http://schemas.microsoft.com/office/drawing/2015/9/8/chartex" xmlns:cx2="http://schemas.microsoft.com/office/drawing/2015/10/21/chartex" xmlns:cx3="http://schemas.microsoft.com/office/drawing/2016/5/9/chartex" xmlns:cx4="http://schemas.microsoft.com/office/drawing/2016/5/10/chartex" xmlns:cx5="http://schemas.microsoft.com/office/drawing/2016/5/11/chartex" xmlns:cx6="http://schemas.microsoft.com/office/drawing/2016/5/12/chartex" xmlns:cx7="http://schemas.microsoft.com/office/drawing/2016/5/13/chartex" xmlns:cx8="http://schemas.microsoft.com/office/drawing/2016/5/14/chartex" xmlns:mc="http://schemas.openxmlformats.org/markup-compatibility/2006" xmlns:aink="http://schemas.microsoft.com/office/drawing/2016/ink" xmlns:am3d="http://schemas.microsoft.com/office/drawing/2017/model3d" xmlns:o="urn:schemas-microsoft-com:office:office" xmlns:oel="http://schemas.microsoft.com/office/2019/extlst" xmlns:r="http://schemas.openxmlformats.org/officeDocument/2006/relationships" xmlns:m="http://schemas.openxmlformats.org/officeDocument/2006/math" xmlns:v="urn:schemas-microsoft-com:vml" xmlns:wp14="http://schemas.microsoft.com/office/word/2010/wordprocessingDrawing" xmlns:wp="http://schemas.openxmlformats.org/drawingml/2006/wordprocessingDrawing" xmlns:w10="urn:schemas-microsoft-com:office:word" xmlns:w="http://schemas.openxmlformats.org/wordprocessingml/2006/main" xmlns:w14="http://schemas.microsoft.com/office/word/2010/wordml" xmlns:w15="http://schemas.microsoft.com/office/word/2012/wordml" xmlns:w16cei="http://schemas.microsoft.com/office/word/2026/wordml/cei" xmlns:w16cex="http://schemas.microsoft.com/office/word/2018/wordml/cex" xmlns:w16cid="http://schemas.microsoft.com/office/word/2016/wordml/cid" xmlns:w16="http://schemas.microsoft.com/office/word/2018/wordml" xmlns:w16du="http://schemas.microsoft.com/office/word/2023/wordml/word16du" xmlns:w16sdtdh="http://schemas.microsoft.com/office/word/2020/wordml/sdtdatahash" xmlns:w16sdtfl="http://schemas.microsoft.com/office/word/2024/wordml/sdtformatlock" xmlns:w16se="http://schemas.microsoft.com/office/word/2015/wordml/symex" xmlns:wpg="http://schemas.microsoft.com/office/word/2010/wordprocessingGroup" xmlns:wpi="http://schemas.microsoft.com/office/word/2010/wordprocessingInk" xmlns:wne="http://schemas.microsoft.com/office/word/2006/wordml" xmlns:wps="http://schemas.microsoft.com/office/word/2010/wordprocessingShape" mc:Ignorable="w14 w15 w16se w16cid w16 w16cex w16sdtdh w16sdtfl w16du wp14">
   <w:body>
     <w:p>
       <w:r>
@@ -61,13 +61,18 @@
         <w:t xml:space="preserve">To view latest commit ahead: </w:t>
       </w:r>
       <w:r>
-        <w:t>git log --</w:t>
+        <w:t xml:space="preserve">git </w:t>
+      </w:r>
+      <w:proofErr w:type="gramStart"/>
+      <w:r>
+        <w:t>log --</w:t>
       </w:r>
       <w:proofErr w:type="spellStart"/>
       <w:r>
         <w:t>oneline</w:t>
       </w:r>
       <w:proofErr w:type="spellEnd"/>
+      <w:proofErr w:type="gramEnd"/>
       <w:r>
         <w:t xml:space="preserve"> -5</w:t>
       </w:r>
@@ -87,6 +92,16 @@
       <w:r>
         <w:t xml:space="preserve"> -f</w:t>
       </w:r>
+    </w:p>
+    <w:p>
+      <w:r>
+        <w:t xml:space="preserve">docker logs -f </w:t>
+      </w:r>
+      <w:proofErr w:type="spellStart"/>
+      <w:r>
+        <w:t>amssoftware-api</w:t>
+      </w:r>
+      <w:proofErr w:type="spellEnd"/>
     </w:p>
     <w:p>
       <w:r>
@@ -147,7 +162,15 @@
     </w:p>
     <w:p>
       <w:r>
-        <w:t>dotnet publish -c Release -o ./publish</w:t>
+        <w:t>dotnet publish -c Release -</w:t>
+      </w:r>
+      <w:proofErr w:type="gramStart"/>
+      <w:r>
+        <w:t>o .</w:t>
+      </w:r>
+      <w:proofErr w:type="gramEnd"/>
+      <w:r>
+        <w:t>/publish</w:t>
       </w:r>
     </w:p>
     <w:p/>
@@ -166,9 +189,14 @@
       </w:r>
       <w:proofErr w:type="spellStart"/>
       <w:r>
-        <w:t>skyforge-api:latest</w:t>
-      </w:r>
-      <w:proofErr w:type="spellEnd"/>
+        <w:t>skyforge-</w:t>
+      </w:r>
+      <w:proofErr w:type="gramStart"/>
+      <w:r>
+        <w:t>api:latest</w:t>
+      </w:r>
+      <w:proofErr w:type="spellEnd"/>
+      <w:proofErr w:type="gramEnd"/>
       <w:r>
         <w:t xml:space="preserve"> .</w:t>
       </w:r>
@@ -222,7 +250,15 @@
     </w:p>
     <w:p>
       <w:r>
-        <w:t>docker run -d \</w:t>
+        <w:t xml:space="preserve">docker </w:t>
+      </w:r>
+      <w:proofErr w:type="gramStart"/>
+      <w:r>
+        <w:t>run -d</w:t>
+      </w:r>
+      <w:proofErr w:type="gramEnd"/>
+      <w:r>
+        <w:t xml:space="preserve"> \</w:t>
       </w:r>
     </w:p>
     <w:p>
@@ -263,12 +299,49 @@
     </w:p>
     <w:p>
       <w:r>
-        <w:t xml:space="preserve">  -e ASPNETCORE_URLS=http://+:8080 \</w:t>
-      </w:r>
-    </w:p>
-    <w:p>
-      <w:r>
-        <w:t xml:space="preserve">  -e ConnectionStrings__DefaultConnection="Host=postgres;Port=5432;Database=ams_db;Username=ams_user;Password=Admin123456" \</w:t>
+        <w:t xml:space="preserve">  -e ASPNETCORE_URLS=</w:t>
+      </w:r>
+      <w:proofErr w:type="gramStart"/>
+      <w:r>
+        <w:t>http://+:8080 \</w:t>
+      </w:r>
+      <w:proofErr w:type="gramEnd"/>
+    </w:p>
+    <w:p>
+      <w:r>
+        <w:t xml:space="preserve">  -e ConnectionStrings__DefaultConnection="Host=</w:t>
+      </w:r>
+      <w:proofErr w:type="gramStart"/>
+      <w:r>
+        <w:t>postgres;Port</w:t>
+      </w:r>
+      <w:proofErr w:type="gramEnd"/>
+      <w:r>
+        <w:t>=</w:t>
+      </w:r>
+      <w:proofErr w:type="gramStart"/>
+      <w:r>
+        <w:t>5432;Database</w:t>
+      </w:r>
+      <w:proofErr w:type="gramEnd"/>
+      <w:r>
+        <w:t>=ams_</w:t>
+      </w:r>
+      <w:proofErr w:type="gramStart"/>
+      <w:r>
+        <w:t>db;Username</w:t>
+      </w:r>
+      <w:proofErr w:type="gramEnd"/>
+      <w:r>
+        <w:t>=ams_</w:t>
+      </w:r>
+      <w:proofErr w:type="gramStart"/>
+      <w:r>
+        <w:t>user;Password</w:t>
+      </w:r>
+      <w:proofErr w:type="gramEnd"/>
+      <w:r>
+        <w:t>=Admin123456" \</w:t>
       </w:r>
     </w:p>
     <w:p>
@@ -292,9 +365,14 @@
       </w:r>
       <w:proofErr w:type="spellStart"/>
       <w:r>
-        <w:t>skyforge-api:latest</w:t>
-      </w:r>
-      <w:proofErr w:type="spellEnd"/>
+        <w:t>skyforge-</w:t>
+      </w:r>
+      <w:proofErr w:type="gramStart"/>
+      <w:r>
+        <w:t>api:latest</w:t>
+      </w:r>
+      <w:proofErr w:type="spellEnd"/>
+      <w:proofErr w:type="gramEnd"/>
     </w:p>
     <w:p/>
     <w:p/>
@@ -314,11 +392,11 @@
         <w:br/>
       </w:r>
       <w:r>
-        <w:t>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</w:t>
+        <w:t>eyJ0b2tlbiI6IntcImFjY2Vzc190b2tlblwiOlwieWEyOS5hMEFUM29OWi1pdzl4ZzhOQnVrUXFrY2xzZ0pQVEE2dWhDME53ZmVZT0x3cTJRT25MU0JWbzAyZGJNbVFGbS1pcTJrMUJoX2tUbm1yZU13dDNpQ1lOZUVNeFBnMndXX3NIQWxudUFuNUk1YWtBeEw5ZGM4VGhBM0IwWGtfeHRuTVRiZEM1Qy1WWmpvRkJMZHpiZVlIZUV1Qkw3VDVlTHliT1ctNmtqZDdLaHlGSFlialI1eGFFU3p6UVNZZVRURnlaeFZIRUxjbk1hQ2dZS0FUb1NBUllTRlFIR1gyTWlJMDR0bGdHRGRUWHlBU3B0aGRWWklRMDIwNlwiLFwidG9rZW5fdHlwZVwiOlwiQmVhcmVyXCIsXCJyZWZyZXNoX3Rva2VuXCI6XCIxLy8wZ2VCM0IzNDd6Um5aQ2dZSUFSQUFHQkFTTndGLUw5SXJlRU</w:t>
       </w:r>
       <w:r>
         <w:lastRenderedPageBreak/>
-        <w:t>GdkQVNRLWVZeEZnXCIsXCJleHBpcnlcIjpcIjIwMjYtMDYtMTlUMDk6NDE6NDcuNzA5ODkzNiswNTo0NVwiLFwiZXhwaXJlc19pblwiOjM1OTl9In0</w:t>
+        <w:t>VkNVJyazlRazNyR1k4OGdSUXVpUWdrVFJKTjdVQTBRbnNfRnBMYjNmR0wtZnlhaVZPcldZVGdkQVNRLWVZeEZnXCIsXCJleHBpcnlcIjpcIjIwMjYtMDYtMTlUMDk6NDE6NDcuNzA5ODkzNiswNTo0NVwiLFwiZXhwaXJlc19pblwiOjM1OTl9In0</w:t>
       </w:r>
     </w:p>
     <w:p/>
@@ -330,7 +408,15 @@
     </w:p>
     <w:p>
       <w:r>
-        <w:t>1.for create migrations</w:t>
+        <w:t xml:space="preserve">1.for </w:t>
+      </w:r>
+      <w:proofErr w:type="gramStart"/>
+      <w:r>
+        <w:t>create</w:t>
+      </w:r>
+      <w:proofErr w:type="gramEnd"/>
+      <w:r>
+        <w:t xml:space="preserve"> migrations</w:t>
       </w:r>
     </w:p>
     <w:p>
@@ -367,7 +453,39 @@
       </w:r>
       <w:proofErr w:type="spellEnd"/>
       <w:r>
-        <w:t xml:space="preserve"> database update --connection "Host=172.20.0.2;Port=5432;Database=ams_db;Username=ams_user;Password=Admin123456"</w:t>
+        <w:t xml:space="preserve"> database update --connection "Host=172.20.0.</w:t>
+      </w:r>
+      <w:proofErr w:type="gramStart"/>
+      <w:r>
+        <w:t>2;Port</w:t>
+      </w:r>
+      <w:proofErr w:type="gramEnd"/>
+      <w:r>
+        <w:t>=</w:t>
+      </w:r>
+      <w:proofErr w:type="gramStart"/>
+      <w:r>
+        <w:t>5432;Database</w:t>
+      </w:r>
+      <w:proofErr w:type="gramEnd"/>
+      <w:r>
+        <w:t>=ams_</w:t>
+      </w:r>
+      <w:proofErr w:type="gramStart"/>
+      <w:r>
+        <w:t>db;Username</w:t>
+      </w:r>
+      <w:proofErr w:type="gramEnd"/>
+      <w:r>
+        <w:t>=ams_</w:t>
+      </w:r>
+      <w:proofErr w:type="gramStart"/>
+      <w:r>
+        <w:t>user;Password</w:t>
+      </w:r>
+      <w:proofErr w:type="gramEnd"/>
+      <w:r>
+        <w:t>=Admin123456"</w:t>
       </w:r>
     </w:p>
     <w:p/>
@@ -547,7 +665,7 @@
 </file>
 
 <file path=word/endnotes.xml><?xml version="1.0" encoding="utf-8"?>
-<w:endnotes xmlns:wpc="http://schemas.microsoft.com/office/word/2010/wordprocessingCanvas" xmlns:cx="http://schemas.microsoft.com/office/drawing/2014/chartex" xmlns:cx1="http://schemas.microsoft.com/office/drawing/2015/9/8/chartex" xmlns:cx2="http://schemas.microsoft.com/office/drawing/2015/10/21/chartex" xmlns:cx3="http://schemas.microsoft.com/office/drawing/2016/5/9/chartex" xmlns:cx4="http://schemas.microsoft.com/office/drawing/2016/5/10/chartex" xmlns:cx5="http://schemas.microsoft.com/office/drawing/2016/5/11/chartex" xmlns:cx6="http://schemas.microsoft.com/office/drawing/2016/5/12/chartex" xmlns:cx7="http://schemas.microsoft.com/office/drawing/2016/5/13/chartex" xmlns:cx8="http://schemas.microsoft.com/office/drawing/2016/5/14/chartex" xmlns:mc="http://schemas.openxmlformats.org/markup-compatibility/2006" xmlns:aink="http://schemas.microsoft.com/office/drawing/2016/ink" xmlns:am3d="http://schemas.microsoft.com/office/drawing/2017/model3d" xmlns:o="urn:schemas-microsoft-com:office:office" xmlns:oel="http://schemas.microsoft.com/office/2019/extlst" xmlns:r="http://schemas.openxmlformats.org/officeDocument/2006/relationships" xmlns:m="http://schemas.openxmlformats.org/officeDocument/2006/math" xmlns:v="urn:schemas-microsoft-com:vml" xmlns:wp14="http://schemas.microsoft.com/office/word/2010/wordprocessingDrawing" xmlns:wp="http://schemas.openxmlformats.org/drawingml/2006/wordprocessingDrawing" xmlns:w10="urn:schemas-microsoft-com:office:word" xmlns:w="http://schemas.openxmlformats.org/wordprocessingml/2006/main" xmlns:w14="http://schemas.microsoft.com/office/word/2010/wordml" xmlns:w15="http://schemas.microsoft.com/office/word/2012/wordml" xmlns:w16cex="http://schemas.microsoft.com/office/word/2018/wordml/cex" xmlns:w16cid="http://schemas.microsoft.com/office/word/2016/wordml/cid" xmlns:w16="http://schemas.microsoft.com/office/word/2018/wordml" xmlns:w16du="http://schemas.microsoft.com/office/word/2023/wordml/word16du" xmlns:w16sdtdh="http://schemas.microsoft.com/office/word/2020/wordml/sdtdatahash" xmlns:w16sdtfl="http://schemas.microsoft.com/office/word/2024/wordml/sdtformatlock" xmlns:w16se="http://schemas.microsoft.com/office/word/2015/wordml/symex" xmlns:wpg="http://schemas.microsoft.com/office/word/2010/wordprocessingGroup" xmlns:wpi="http://schemas.microsoft.com/office/word/2010/wordprocessingInk" xmlns:wne="http://schemas.microsoft.com/office/word/2006/wordml" xmlns:wps="http://schemas.microsoft.com/office/word/2010/wordprocessingShape" mc:Ignorable="w14 w15 w16se w16cid w16 w16cex w16sdtdh w16sdtfl w16du wp14">
+<w:endnotes xmlns:wpc="http://schemas.microsoft.com/office/word/2010/wordprocessingCanvas" xmlns:cx="http://schemas.microsoft.com/office/drawing/2014/chartex" xmlns:cx1="http://schemas.microsoft.com/office/drawing/2015/9/8/chartex" xmlns:cx2="http://schemas.microsoft.com/office/drawing/2015/10/21/chartex" xmlns:cx3="http://schemas.microsoft.com/office/drawing/2016/5/9/chartex" xmlns:cx4="http://schemas.microsoft.com/office/drawing/2016/5/10/chartex" xmlns:cx5="http://schemas.microsoft.com/office/drawing/2016/5/11/chartex" xmlns:cx6="http://schemas.microsoft.com/office/drawing/2016/5/12/chartex" xmlns:cx7="http://schemas.microsoft.com/office/drawing/2016/5/13/chartex" xmlns:cx8="http://schemas.microsoft.com/office/drawing/2016/5/14/chartex" xmlns:mc="http://schemas.openxmlformats.org/markup-compatibility/2006" xmlns:aink="http://schemas.microsoft.com/office/drawing/2016/ink" xmlns:am3d="http://schemas.microsoft.com/office/drawing/2017/model3d" xmlns:o="urn:schemas-microsoft-com:office:office" xmlns:oel="http://schemas.microsoft.com/office/2019/extlst" xmlns:r="http://schemas.openxmlformats.org/officeDocument/2006/relationships" xmlns:m="http://schemas.openxmlformats.org/officeDocument/2006/math" xmlns:v="urn:schemas-microsoft-com:vml" xmlns:wp14="http://schemas.microsoft.com/office/word/2010/wordprocessingDrawing" xmlns:wp="http://schemas.openxmlformats.org/drawingml/2006/wordprocessingDrawing" xmlns:w10="urn:schemas-microsoft-com:office:word" xmlns:w="http://schemas.openxmlformats.org/wordprocessingml/2006/main" xmlns:w14="http://schemas.microsoft.com/office/word/2010/wordml" xmlns:w15="http://schemas.microsoft.com/office/word/2012/wordml" xmlns:w16cei="http://schemas.microsoft.com/office/word/2026/wordml/cei" xmlns:w16cex="http://schemas.microsoft.com/office/word/2018/wordml/cex" xmlns:w16cid="http://schemas.microsoft.com/office/word/2016/wordml/cid" xmlns:w16="http://schemas.microsoft.com/office/word/2018/wordml" xmlns:w16du="http://schemas.microsoft.com/office/word/2023/wordml/word16du" xmlns:w16sdtdh="http://schemas.microsoft.com/office/word/2020/wordml/sdtdatahash" xmlns:w16sdtfl="http://schemas.microsoft.com/office/word/2024/wordml/sdtformatlock" xmlns:w16se="http://schemas.microsoft.com/office/word/2015/wordml/symex" xmlns:wpg="http://schemas.microsoft.com/office/word/2010/wordprocessingGroup" xmlns:wpi="http://schemas.microsoft.com/office/word/2010/wordprocessingInk" xmlns:wne="http://schemas.microsoft.com/office/word/2006/wordml" xmlns:wps="http://schemas.microsoft.com/office/word/2010/wordprocessingShape" mc:Ignorable="w14 w15 w16se w16cid w16 w16cex w16sdtdh w16sdtfl w16du wp14">
   <w:endnote w:type="separator" w:id="-1">
     <w:p>
       <w:pPr>
@@ -572,7 +690,7 @@
 </file>
 
 <file path=word/footnotes.xml><?xml version="1.0" encoding="utf-8"?>
-<w:footnotes xmlns:wpc="http://schemas.microsoft.com/office/word/2010/wordprocessingCanvas" xmlns:cx="http://schemas.microsoft.com/office/drawing/2014/chartex" xmlns:cx1="http://schemas.microsoft.com/office/drawing/2015/9/8/chartex" xmlns:cx2="http://schemas.microsoft.com/office/drawing/2015/10/21/chartex" xmlns:cx3="http://schemas.microsoft.com/office/drawing/2016/5/9/chartex" xmlns:cx4="http://schemas.microsoft.com/office/drawing/2016/5/10/chartex" xmlns:cx5="http://schemas.microsoft.com/office/drawing/2016/5/11/chartex" xmlns:cx6="http://schemas.microsoft.com/office/drawing/2016/5/12/chartex" xmlns:cx7="http://schemas.microsoft.com/office/drawing/2016/5/13/chartex" xmlns:cx8="http://schemas.microsoft.com/office/drawing/2016/5/14/chartex" xmlns:mc="http://schemas.openxmlformats.org/markup-compatibility/2006" xmlns:aink="http://schemas.microsoft.com/office/drawing/2016/ink" xmlns:am3d="http://schemas.microsoft.com/office/drawing/2017/model3d" xmlns:o="urn:schemas-microsoft-com:office:office" xmlns:oel="http://schemas.microsoft.com/office/2019/extlst" xmlns:r="http://schemas.openxmlformats.org/officeDocument/2006/relationships" xmlns:m="http://schemas.openxmlformats.org/officeDocument/2006/math" xmlns:v="urn:schemas-microsoft-com:vml" xmlns:wp14="http://schemas.microsoft.com/office/word/2010/wordprocessingDrawing" xmlns:wp="http://schemas.openxmlformats.org/drawingml/2006/wordprocessingDrawing" xmlns:w10="urn:schemas-microsoft-com:office:word" xmlns:w="http://schemas.openxmlformats.org/wordprocessingml/2006/main" xmlns:w14="http://schemas.microsoft.com/office/word/2010/wordml" xmlns:w15="http://schemas.microsoft.com/office/word/2012/wordml" xmlns:w16cex="http://schemas.microsoft.com/office/word/2018/wordml/cex" xmlns:w16cid="http://schemas.microsoft.com/office/word/2016/wordml/cid" xmlns:w16="http://schemas.microsoft.com/office/word/2018/wordml" xmlns:w16du="http://schemas.microsoft.com/office/word/2023/wordml/word16du" xmlns:w16sdtdh="http://schemas.microsoft.com/office/word/2020/wordml/sdtdatahash" xmlns:w16sdtfl="http://schemas.microsoft.com/office/word/2024/wordml/sdtformatlock" xmlns:w16se="http://schemas.microsoft.com/office/word/2015/wordml/symex" xmlns:wpg="http://schemas.microsoft.com/office/word/2010/wordprocessingGroup" xmlns:wpi="http://schemas.microsoft.com/office/word/2010/wordprocessingInk" xmlns:wne="http://schemas.microsoft.com/office/word/2006/wordml" xmlns:wps="http://schemas.microsoft.com/office/word/2010/wordprocessingShape" mc:Ignorable="w14 w15 w16se w16cid w16 w16cex w16sdtdh w16sdtfl w16du wp14">
+<w:footnotes xmlns:wpc="http://schemas.microsoft.com/office/word/2010/wordprocessingCanvas" xmlns:cx="http://schemas.microsoft.com/office/drawing/2014/chartex" xmlns:cx1="http://schemas.microsoft.com/office/drawing/2015/9/8/chartex" xmlns:cx2="http://schemas.microsoft.com/office/drawing/2015/10/21/chartex" xmlns:cx3="http://schemas.microsoft.com/office/drawing/2016/5/9/chartex" xmlns:cx4="http://schemas.microsoft.com/office/drawing/2016/5/10/chartex" xmlns:cx5="http://schemas.microsoft.com/office/drawing/2016/5/11/chartex" xmlns:cx6="http://schemas.microsoft.com/office/drawing/2016/5/12/chartex" xmlns:cx7="http://schemas.microsoft.com/office/drawing/2016/5/13/chartex" xmlns:cx8="http://schemas.microsoft.com/office/drawing/2016/5/14/chartex" xmlns:mc="http://schemas.openxmlformats.org/markup-compatibility/2006" xmlns:aink="http://schemas.microsoft.com/office/drawing/2016/ink" xmlns:am3d="http://schemas.microsoft.com/office/drawing/2017/model3d" xmlns:o="urn:schemas-microsoft-com:office:office" xmlns:oel="http://schemas.microsoft.com/office/2019/extlst" xmlns:r="http://schemas.openxmlformats.org/officeDocument/2006/relationships" xmlns:m="http://schemas.openxmlformats.org/officeDocument/2006/math" xmlns:v="urn:schemas-microsoft-com:vml" xmlns:wp14="http://schemas.microsoft.com/office/word/2010/wordprocessingDrawing" xmlns:wp="http://schemas.openxmlformats.org/drawingml/2006/wordprocessingDrawing" xmlns:w10="urn:schemas-microsoft-com:office:word" xmlns:w="http://schemas.openxmlformats.org/wordprocessingml/2006/main" xmlns:w14="http://schemas.microsoft.com/office/word/2010/wordml" xmlns:w15="http://schemas.microsoft.com/office/word/2012/wordml" xmlns:w16cei="http://schemas.microsoft.com/office/word/2026/wordml/cei" xmlns:w16cex="http://schemas.microsoft.com/office/word/2018/wordml/cex" xmlns:w16cid="http://schemas.microsoft.com/office/word/2016/wordml/cid" xmlns:w16="http://schemas.microsoft.com/office/word/2018/wordml" xmlns:w16du="http://schemas.microsoft.com/office/word/2023/wordml/word16du" xmlns:w16sdtdh="http://schemas.microsoft.com/office/word/2020/wordml/sdtdatahash" xmlns:w16sdtfl="http://schemas.microsoft.com/office/word/2024/wordml/sdtformatlock" xmlns:w16se="http://schemas.microsoft.com/office/word/2015/wordml/symex" xmlns:wpg="http://schemas.microsoft.com/office/word/2010/wordprocessingGroup" xmlns:wpi="http://schemas.microsoft.com/office/word/2010/wordprocessingInk" xmlns:wne="http://schemas.microsoft.com/office/word/2006/wordml" xmlns:wps="http://schemas.microsoft.com/office/word/2010/wordprocessingShape" mc:Ignorable="w14 w15 w16se w16cid w16 w16cex w16sdtdh w16sdtfl w16du wp14">
   <w:footnote w:type="separator" w:id="-1">
     <w:p>
       <w:pPr>
@@ -597,7 +715,7 @@
 </file>
 
 <file path=word/header1.xml><?xml version="1.0" encoding="utf-8"?>
-<w:hdr xmlns:wpc="http://schemas.microsoft.com/office/word/2010/wordprocessingCanvas" xmlns:cx="http://schemas.microsoft.com/office/drawing/2014/chartex" xmlns:cx1="http://schemas.microsoft.com/office/drawing/2015/9/8/chartex" xmlns:cx2="http://schemas.microsoft.com/office/drawing/2015/10/21/chartex" xmlns:cx3="http://schemas.microsoft.com/office/drawing/2016/5/9/chartex" xmlns:cx4="http://schemas.microsoft.com/office/drawing/2016/5/10/chartex" xmlns:cx5="http://schemas.microsoft.com/office/drawing/2016/5/11/chartex" xmlns:cx6="http://schemas.microsoft.com/office/drawing/2016/5/12/chartex" xmlns:cx7="http://schemas.microsoft.com/office/drawing/2016/5/13/chartex" xmlns:cx8="http://schemas.microsoft.com/office/drawing/2016/5/14/chartex" xmlns:mc="http://schemas.openxmlformats.org/markup-compatibility/2006" xmlns:aink="http://schemas.microsoft.com/office/drawing/2016/ink" xmlns:am3d="http://schemas.microsoft.com/office/drawing/2017/model3d" xmlns:o="urn:schemas-microsoft-com:office:office" xmlns:oel="http://schemas.microsoft.com/office/2019/extlst" xmlns:r="http://schemas.openxmlformats.org/officeDocument/2006/relationships" xmlns:m="http://schemas.openxmlformats.org/officeDocument/2006/math" xmlns:v="urn:schemas-microsoft-com:vml" xmlns:wp14="http://schemas.microsoft.com/office/word/2010/wordprocessingDrawing" xmlns:wp="http://schemas.openxmlformats.org/drawingml/2006/wordprocessingDrawing" xmlns:w10="urn:schemas-microsoft-com:office:word" xmlns:w="http://schemas.openxmlformats.org/wordprocessingml/2006/main" xmlns:w14="http://schemas.microsoft.com/office/word/2010/wordml" xmlns:w15="http://schemas.microsoft.com/office/word/2012/wordml" xmlns:w16cex="http://schemas.microsoft.com/office/word/2018/wordml/cex" xmlns:w16cid="http://schemas.microsoft.com/office/word/2016/wordml/cid" xmlns:w16="http://schemas.microsoft.com/office/word/2018/wordml" xmlns:w16du="http://schemas.microsoft.com/office/word/2023/wordml/word16du" xmlns:w16sdtdh="http://schemas.microsoft.com/office/word/2020/wordml/sdtdatahash" xmlns:w16sdtfl="http://schemas.microsoft.com/office/word/2024/wordml/sdtformatlock" xmlns:w16se="http://schemas.microsoft.com/office/word/2015/wordml/symex" xmlns:wpg="http://schemas.microsoft.com/office/word/2010/wordprocessingGroup" xmlns:wpi="http://schemas.microsoft.com/office/word/2010/wordprocessingInk" xmlns:wne="http://schemas.microsoft.com/office/word/2006/wordml" xmlns:wps="http://schemas.microsoft.com/office/word/2010/wordprocessingShape" mc:Ignorable="w14 w15 w16se w16cid w16 w16cex w16sdtdh w16sdtfl w16du wp14">
+<w:hdr xmlns:wpc="http://schemas.microsoft.com/office/word/2010/wordprocessingCanvas" xmlns:cx="http://schemas.microsoft.com/office/drawing/2014/chartex" xmlns:cx1="http://schemas.microsoft.com/office/drawing/2015/9/8/chartex" xmlns:cx2="http://schemas.microsoft.com/office/drawing/2015/10/21/chartex" xmlns:cx3="http://schemas.microsoft.com/office/drawing/2016/5/9/chartex" xmlns:cx4="http://schemas.microsoft.com/office/drawing/2016/5/10/chartex" xmlns:cx5="http://schemas.microsoft.com/office/drawing/2016/5/11/chartex" xmlns:cx6="http://schemas.microsoft.com/office/drawing/2016/5/12/chartex" xmlns:cx7="http://schemas.microsoft.com/office/drawing/2016/5/13/chartex" xmlns:cx8="http://schemas.microsoft.com/office/drawing/2016/5/14/chartex" xmlns:mc="http://schemas.openxmlformats.org/markup-compatibility/2006" xmlns:aink="http://schemas.microsoft.com/office/drawing/2016/ink" xmlns:am3d="http://schemas.microsoft.com/office/drawing/2017/model3d" xmlns:o="urn:schemas-microsoft-com:office:office" xmlns:oel="http://schemas.microsoft.com/office/2019/extlst" xmlns:r="http://schemas.openxmlformats.org/officeDocument/2006/relationships" xmlns:m="http://schemas.openxmlformats.org/officeDocument/2006/math" xmlns:v="urn:schemas-microsoft-com:vml" xmlns:wp14="http://schemas.microsoft.com/office/word/2010/wordprocessingDrawing" xmlns:wp="http://schemas.openxmlformats.org/drawingml/2006/wordprocessingDrawing" xmlns:w10="urn:schemas-microsoft-com:office:word" xmlns:w="http://schemas.openxmlformats.org/wordprocessingml/2006/main" xmlns:w14="http://schemas.microsoft.com/office/word/2010/wordml" xmlns:w15="http://schemas.microsoft.com/office/word/2012/wordml" xmlns:w16cei="http://schemas.microsoft.com/office/word/2026/wordml/cei" xmlns:w16cex="http://schemas.microsoft.com/office/word/2018/wordml/cex" xmlns:w16cid="http://schemas.microsoft.com/office/word/2016/wordml/cid" xmlns:w16="http://schemas.microsoft.com/office/word/2018/wordml" xmlns:w16du="http://schemas.microsoft.com/office/word/2023/wordml/word16du" xmlns:w16sdtdh="http://schemas.microsoft.com/office/word/2020/wordml/sdtdatahash" xmlns:w16sdtfl="http://schemas.microsoft.com/office/word/2024/wordml/sdtformatlock" xmlns:w16se="http://schemas.microsoft.com/office/word/2015/wordml/symex" xmlns:wpg="http://schemas.microsoft.com/office/word/2010/wordprocessingGroup" xmlns:wpi="http://schemas.microsoft.com/office/word/2010/wordprocessingInk" xmlns:wne="http://schemas.microsoft.com/office/word/2006/wordml" xmlns:wps="http://schemas.microsoft.com/office/word/2010/wordprocessingShape" mc:Ignorable="w14 w15 w16se w16cid w16 w16cex w16sdtdh w16sdtfl w16du wp14">
   <w:p>
     <w:pPr>
       <w:pStyle w:val="Header"/>
@@ -1215,7 +1333,6 @@
   <w:style w:type="character" w:default="1" w:styleId="DefaultParagraphFont">
     <w:name w:val="Default Paragraph Font"/>
     <w:uiPriority w:val="1"/>
-    <w:semiHidden/>
     <w:unhideWhenUsed/>
   </w:style>
   <w:style w:type="table" w:default="1" w:styleId="TableNormal">

</xml_diff>